<commit_message>
Task-063: Final requirements docs  update
</commit_message>
<xml_diff>
--- a/reports/Group/00 - Requirements - Group.docx
+++ b/reports/Group/00 - Requirements - Group.docx
@@ -1668,7 +1668,13 @@
                   <w:rPr>
                     <w:rFonts w:asciiTheme="majorHAnsi" w:hAnsiTheme="majorHAnsi" w:cstheme="majorHAnsi"/>
                   </w:rPr>
-                  <w:t>16</w:t>
+                  <w:t>1</w:t>
+                </w:r>
+                <w:r>
+                  <w:rPr>
+                    <w:rFonts w:asciiTheme="majorHAnsi" w:hAnsiTheme="majorHAnsi" w:cstheme="majorHAnsi"/>
+                  </w:rPr>
+                  <w:t>8</w:t>
                 </w:r>
                 <w:r>
                   <w:rPr>
@@ -5695,17 +5701,12 @@
           <w:placeholder>
             <w:docPart w:val="47CA89A49EB742FF9BF3E463DC5B7387"/>
           </w:placeholder>
-          <w:showingPlcHdr/>
           <w15:appearance w15:val="hidden"/>
           <w:text/>
         </w:sdtPr>
         <w:sdtContent>
           <w:r>
-            <w:rPr>
-              <w:rStyle w:val="Textodelmarcadordeposicin"/>
-              <w:lang w:val="es-ES"/>
-            </w:rPr>
-            <w:t>Haga clic o pulse aquí para escribir texto.</w:t>
+            <w:t xml:space="preserve"> </w:t>
           </w:r>
         </w:sdtContent>
       </w:sdt>
@@ -5734,17 +5735,12 @@
           <w:placeholder>
             <w:docPart w:val="4A6F5572702444E6822E46C8872D64C0"/>
           </w:placeholder>
-          <w:showingPlcHdr/>
           <w15:appearance w15:val="hidden"/>
           <w:text/>
         </w:sdtPr>
         <w:sdtContent>
           <w:r>
-            <w:rPr>
-              <w:rStyle w:val="Textodelmarcadordeposicin"/>
-              <w:lang w:val="es-ES"/>
-            </w:rPr>
-            <w:t>Haga clic o pulse aquí para escribir texto.</w:t>
+            <w:t xml:space="preserve"> </w:t>
           </w:r>
         </w:sdtContent>
       </w:sdt>
@@ -6180,16 +6176,12 @@
           <w:placeholder>
             <w:docPart w:val="97D9304286854C40A7E9B4DA4EA73B2A"/>
           </w:placeholder>
-          <w:showingPlcHdr/>
           <w15:appearance w15:val="hidden"/>
           <w:text/>
         </w:sdtPr>
         <w:sdtContent>
           <w:r>
-            <w:rPr>
-              <w:rStyle w:val="Textodelmarcadordeposicin"/>
-            </w:rPr>
-            <w:t>Haga clic o pulse aquí para escribir texto.</w:t>
+            <w:t xml:space="preserve"> </w:t>
           </w:r>
         </w:sdtContent>
       </w:sdt>
@@ -6928,17 +6920,12 @@
           <w:placeholder>
             <w:docPart w:val="D22CDBE2068C473F96F013E81AFD72E2"/>
           </w:placeholder>
-          <w:showingPlcHdr/>
           <w15:appearance w15:val="hidden"/>
           <w:text/>
         </w:sdtPr>
         <w:sdtContent>
           <w:r>
-            <w:rPr>
-              <w:rStyle w:val="Textodelmarcadordeposicin"/>
-              <w:lang w:val="es-ES"/>
-            </w:rPr>
-            <w:t>Haga clic o pulse aquí para escribir texto.</w:t>
+            <w:t xml:space="preserve"> </w:t>
           </w:r>
         </w:sdtContent>
       </w:sdt>
@@ -7041,17 +7028,12 @@
           <w:placeholder>
             <w:docPart w:val="2FBEA80A5B7C4EB4BEE4E798A37FE3EB"/>
           </w:placeholder>
-          <w:showingPlcHdr/>
           <w15:appearance w15:val="hidden"/>
           <w:text/>
         </w:sdtPr>
         <w:sdtContent>
           <w:r>
-            <w:rPr>
-              <w:rStyle w:val="Textodelmarcadordeposicin"/>
-              <w:lang w:val="es-ES"/>
-            </w:rPr>
-            <w:t>Haga clic o pulse aquí para escribir texto.</w:t>
+            <w:t xml:space="preserve"> </w:t>
           </w:r>
         </w:sdtContent>
       </w:sdt>
@@ -10773,6 +10755,7 @@
     <w:rsid w:val="00055A68"/>
     <w:rsid w:val="00067FEB"/>
     <w:rsid w:val="0009453F"/>
+    <w:rsid w:val="000A1D33"/>
     <w:rsid w:val="000B5C7E"/>
     <w:rsid w:val="000C4A78"/>
     <w:rsid w:val="00117B5F"/>
@@ -10872,6 +10855,7 @@
     <w:rsid w:val="00F970E5"/>
     <w:rsid w:val="00FA49C5"/>
     <w:rsid w:val="00FC4BFC"/>
+    <w:rsid w:val="00FD3FBE"/>
     <w:rsid w:val="00FE6BFD"/>
   </w:rsids>
   <m:mathPr>

</xml_diff>